<commit_message>
docs: add updated Sprint 2 master document
</commit_message>
<xml_diff>
--- a/26 - Grand Prix Ecosystem Operations - S2W1_master.docx
+++ b/26 - Grand Prix Ecosystem Operations - S2W1_master.docx
@@ -4318,7 +4318,13 @@
           </w:tcPr>
           <w:p>
             <w:r>
-              <w:t>Friday, 18 September 2026</w:t>
+              <w:t>Friday, 1</w:t>
+            </w:r>
+            <w:r>
+              <w:t>7</w:t>
+            </w:r>
+            <w:r>
+              <w:t xml:space="preserve"> September 2026</w:t>
             </w:r>
           </w:p>
         </w:tc>
@@ -4517,7 +4523,17 @@
             <w:vAlign w:val="center"/>
             <w:hideMark/>
           </w:tcPr>
-          <w:p/>
+          <w:p>
+            <w:r>
+              <w:t>Friday, 1</w:t>
+            </w:r>
+            <w:r>
+              <w:t>8</w:t>
+            </w:r>
+            <w:r>
+              <w:t xml:space="preserve"> September 2026</w:t>
+            </w:r>
+          </w:p>
         </w:tc>
       </w:tr>
     </w:tbl>
@@ -4573,18 +4589,18 @@
       </w:r>
     </w:p>
     <w:p>
-      <w:pPr>
-        <w:rPr>
-          <w:b/>
-          <w:bCs/>
-        </w:rPr>
-      </w:pPr>
       <w:r>
         <w:rPr>
           <w:b/>
           <w:bCs/>
         </w:rPr>
         <w:t>Git URL:</w:t>
+      </w:r>
+      <w:r>
+        <w:t xml:space="preserve"> </w:t>
+      </w:r>
+      <w:r>
+        <w:t>https://github.com/Joel-Wat/Capstone-26-Team-2/tree/main/Sprint%202/UX/UX%20Artefacts</w:t>
       </w:r>
     </w:p>
     <w:p>
@@ -5120,6 +5136,7 @@
           <w:b/>
           <w:bCs/>
         </w:rPr>
+        <w:lastRenderedPageBreak/>
         <w:t xml:space="preserve">Note for next role: </w:t>
       </w:r>
     </w:p>
@@ -5129,7 +5146,6 @@
         <w:spacing w:before="320" w:after="140"/>
       </w:pPr>
       <w:r>
-        <w:lastRenderedPageBreak/>
         <w:t>Begin Prototype Development</w:t>
       </w:r>
       <w:r>

</xml_diff>

<commit_message>
docs: updated Sprint 2 master doc
</commit_message>
<xml_diff>
--- a/26 - Grand Prix Ecosystem Operations - S2W1_master.docx
+++ b/26 - Grand Prix Ecosystem Operations - S2W1_master.docx
@@ -1,6 +1,6 @@
 
 <file path=word/document.xml><?xml version="1.0" encoding="utf-8"?>
-<w:document xmlns:wpc="http://schemas.microsoft.com/office/word/2010/wordprocessingCanvas" xmlns:cx="http://schemas.microsoft.com/office/drawing/2014/chartex" xmlns:cx1="http://schemas.microsoft.com/office/drawing/2015/9/8/chartex" xmlns:cx2="http://schemas.microsoft.com/office/drawing/2015/10/21/chartex" xmlns:cx3="http://schemas.microsoft.com/office/drawing/2016/5/9/chartex" xmlns:cx4="http://schemas.microsoft.com/office/drawing/2016/5/10/chartex" xmlns:cx5="http://schemas.microsoft.com/office/drawing/2016/5/11/chartex" xmlns:cx6="http://schemas.microsoft.com/office/drawing/2016/5/12/chartex" xmlns:cx7="http://schemas.microsoft.com/office/drawing/2016/5/13/chartex" xmlns:cx8="http://schemas.microsoft.com/office/drawing/2016/5/14/chartex" xmlns:mc="http://schemas.openxmlformats.org/markup-compatibility/2006" xmlns:m="http://schemas.openxmlformats.org/officeDocument/2006/math" xmlns:aink="http://schemas.microsoft.com/office/drawing/2016/ink" xmlns:am3d="http://schemas.microsoft.com/office/drawing/2017/model3d" xmlns:oel="http://schemas.microsoft.com/office/2019/extlst" xmlns:r="http://schemas.openxmlformats.org/officeDocument/2006/relationships" xmlns:wp14="http://schemas.microsoft.com/office/word/2010/wordprocessingDrawing" xmlns:wp="http://schemas.openxmlformats.org/drawingml/2006/wordprocessingDrawing" xmlns:wpg="http://schemas.microsoft.com/office/word/2010/wordprocessingGroup" xmlns:wpi="http://schemas.microsoft.com/office/word/2010/wordprocessingInk" xmlns:wps="http://schemas.microsoft.com/office/word/2010/wordprocessingShape" xmlns:o="urn:schemas-microsoft-com:office:office" xmlns:v="urn:schemas-microsoft-com:vml" xmlns:w10="urn:schemas-microsoft-com:office:word" xmlns:w="http://schemas.openxmlformats.org/wordprocessingml/2006/main" xmlns:w14="http://schemas.microsoft.com/office/word/2010/wordml" xmlns:w15="http://schemas.microsoft.com/office/word/2012/wordml" xmlns:w16cex="http://schemas.microsoft.com/office/word/2018/wordml/cex" xmlns:w16cid="http://schemas.microsoft.com/office/word/2016/wordml/cid" xmlns:w16="http://schemas.microsoft.com/office/word/2018/wordml" xmlns:w16sdtdh="http://schemas.microsoft.com/office/word/2020/wordml/sdtdatahash" xmlns:w16sdtfl="http://schemas.microsoft.com/office/word/2024/wordml/sdtformatlock" xmlns:w16se="http://schemas.microsoft.com/office/word/2015/wordml/symex" xmlns:w16du="http://schemas.microsoft.com/office/word/2023/wordml/word16du" xmlns:wne="http://schemas.microsoft.com/office/word/2006/wordml" mc:Ignorable="w14 w15 w16se w16cid w16 w16cex w16sdtdh w16sdtfl w16du wp14">
+<w:document xmlns:wpc="http://schemas.microsoft.com/office/word/2010/wordprocessingCanvas" xmlns:cx="http://schemas.microsoft.com/office/drawing/2014/chartex" xmlns:cx1="http://schemas.microsoft.com/office/drawing/2015/9/8/chartex" xmlns:cx2="http://schemas.microsoft.com/office/drawing/2015/10/21/chartex" xmlns:cx3="http://schemas.microsoft.com/office/drawing/2016/5/9/chartex" xmlns:cx4="http://schemas.microsoft.com/office/drawing/2016/5/10/chartex" xmlns:cx5="http://schemas.microsoft.com/office/drawing/2016/5/11/chartex" xmlns:cx6="http://schemas.microsoft.com/office/drawing/2016/5/12/chartex" xmlns:cx7="http://schemas.microsoft.com/office/drawing/2016/5/13/chartex" xmlns:cx8="http://schemas.microsoft.com/office/drawing/2016/5/14/chartex" xmlns:mc="http://schemas.openxmlformats.org/markup-compatibility/2006" xmlns:aink="http://schemas.microsoft.com/office/drawing/2016/ink" xmlns:am3d="http://schemas.microsoft.com/office/drawing/2017/model3d" xmlns:o="urn:schemas-microsoft-com:office:office" xmlns:oel="http://schemas.microsoft.com/office/2019/extlst" xmlns:r="http://schemas.openxmlformats.org/officeDocument/2006/relationships" xmlns:m="http://schemas.openxmlformats.org/officeDocument/2006/math" xmlns:v="urn:schemas-microsoft-com:vml" xmlns:wp14="http://schemas.microsoft.com/office/word/2010/wordprocessingDrawing" xmlns:wp="http://schemas.openxmlformats.org/drawingml/2006/wordprocessingDrawing" xmlns:w10="urn:schemas-microsoft-com:office:word" xmlns:w="http://schemas.openxmlformats.org/wordprocessingml/2006/main" xmlns:w14="http://schemas.microsoft.com/office/word/2010/wordml" xmlns:w15="http://schemas.microsoft.com/office/word/2012/wordml" xmlns:w16cex="http://schemas.microsoft.com/office/word/2018/wordml/cex" xmlns:w16cid="http://schemas.microsoft.com/office/word/2016/wordml/cid" xmlns:w16="http://schemas.microsoft.com/office/word/2018/wordml" xmlns:w16du="http://schemas.microsoft.com/office/word/2023/wordml/word16du" xmlns:w16sdtdh="http://schemas.microsoft.com/office/word/2020/wordml/sdtdatahash" xmlns:w16sdtfl="http://schemas.microsoft.com/office/word/2024/wordml/sdtformatlock" xmlns:w16se="http://schemas.microsoft.com/office/word/2015/wordml/symex" xmlns:wpg="http://schemas.microsoft.com/office/word/2010/wordprocessingGroup" xmlns:wpi="http://schemas.microsoft.com/office/word/2010/wordprocessingInk" xmlns:wne="http://schemas.microsoft.com/office/word/2006/wordml" xmlns:wps="http://schemas.microsoft.com/office/word/2010/wordprocessingShape" mc:Ignorable="w14 w15 w16se w16cid w16 w16cex w16sdtdh w16sdtfl w16du wp14">
   <w:body>
     <w:p>
       <w:pPr>
@@ -507,15 +507,7 @@
               <w:t>:</w:t>
             </w:r>
             <w:r>
-              <w:t xml:space="preserve"> </w:t>
-            </w:r>
-            <w:proofErr w:type="spellStart"/>
-            <w:r>
-              <w:t>Tianxiang</w:t>
-            </w:r>
-            <w:proofErr w:type="spellEnd"/>
-            <w:r>
-              <w:t xml:space="preserve"> Hang </w:t>
+              <w:t xml:space="preserve"> Tianxiang Hang </w:t>
             </w:r>
           </w:p>
         </w:tc>
@@ -4366,11 +4358,7 @@
         <w:t xml:space="preserve">Deliverable: </w:t>
       </w:r>
       <w:r>
-        <w:t xml:space="preserve">Finalised prototype wireframes and supporting UX artefacts uploaded to the shared GitHub </w:t>
-      </w:r>
-      <w:proofErr w:type="spellStart"/>
-      <w:r>
-        <w:t>repository.</w:t>
+        <w:t>Finalised prototype wireframes and supporting UX artefacts uploaded to the shared GitHub repository.</w:t>
       </w:r>
     </w:p>
     <w:p>
@@ -4380,15 +4368,7 @@
           <w:bCs/>
         </w:rPr>
         <w:lastRenderedPageBreak/>
-        <w:t>Not</w:t>
-      </w:r>
-      <w:proofErr w:type="spellEnd"/>
-      <w:r>
-        <w:rPr>
-          <w:b/>
-          <w:bCs/>
-        </w:rPr>
-        <w:t xml:space="preserve">e for next role: </w:t>
+        <w:t xml:space="preserve">Note for next role: </w:t>
       </w:r>
       <w:r>
         <w:t>PM to review the finalised wireframes. The designs are ready to be used as the visual reference for prototype implementation.</w:t>
@@ -4525,13 +4505,7 @@
           </w:tcPr>
           <w:p>
             <w:r>
-              <w:t>Friday, 1</w:t>
-            </w:r>
-            <w:r>
-              <w:t>8</w:t>
-            </w:r>
-            <w:r>
-              <w:t xml:space="preserve"> September 2026</w:t>
+              <w:t>Friday, 18 September 2026</w:t>
             </w:r>
           </w:p>
         </w:tc>
@@ -4597,10 +4571,7 @@
         <w:t>Git URL:</w:t>
       </w:r>
       <w:r>
-        <w:t xml:space="preserve"> </w:t>
-      </w:r>
-      <w:r>
-        <w:t>https://github.com/Joel-Wat/Capstone-26-Team-2/tree/main/Sprint%202/UX/UX%20Artefacts</w:t>
+        <w:t xml:space="preserve"> https://github.com/Joel-Wat/Capstone-26-Team-2/tree/main/Sprint%202/UX/UX%20Artefacts</w:t>
       </w:r>
     </w:p>
     <w:p>
@@ -5045,15 +5016,13 @@
           </w:tcPr>
           <w:p>
             <w:r>
-              <w:t xml:space="preserve">Dev 2: </w:t>
-            </w:r>
-            <w:proofErr w:type="spellStart"/>
-            <w:r>
-              <w:t>Tianxang</w:t>
-            </w:r>
-            <w:proofErr w:type="spellEnd"/>
-            <w:r>
-              <w:t xml:space="preserve"> Hang  </w:t>
+              <w:t>Dev 2: Tianx</w:t>
+            </w:r>
+            <w:r>
+              <w:t>i</w:t>
+            </w:r>
+            <w:r>
+              <w:t>ang Hang  </w:t>
             </w:r>
           </w:p>
         </w:tc>
@@ -5096,7 +5065,11 @@
             <w:vAlign w:val="center"/>
             <w:hideMark/>
           </w:tcPr>
-          <w:p/>
+          <w:p>
+            <w:r>
+              <w:t>20/09/2026</w:t>
+            </w:r>
+          </w:p>
         </w:tc>
       </w:tr>
     </w:tbl>
@@ -5120,14 +5093,21 @@
         </w:rPr>
         <w:t>Done:</w:t>
       </w:r>
-    </w:p>
-    <w:p>
-      <w:r>
-        <w:rPr>
-          <w:b/>
-          <w:bCs/>
-        </w:rPr>
-        <w:t xml:space="preserve">Deliverable: </w:t>
+      <w:r>
+        <w:rPr>
+          <w:b/>
+          <w:bCs/>
+        </w:rPr>
+        <w:t xml:space="preserve"> </w:t>
+      </w:r>
+      <w:r>
+        <w:t xml:space="preserve">mapped personas to system roles and </w:t>
+      </w:r>
+      <w:r>
+        <w:t xml:space="preserve">defined technical workflow and application structure. Defined route for each system role </w:t>
+      </w:r>
+      <w:r>
+        <w:t>for each persona journey.</w:t>
       </w:r>
     </w:p>
     <w:p>
@@ -5137,7 +5117,44 @@
           <w:bCs/>
         </w:rPr>
         <w:lastRenderedPageBreak/>
+        <w:t>Deliverable:</w:t>
+      </w:r>
+      <w:r>
+        <w:t xml:space="preserve"> </w:t>
+      </w:r>
+      <w:r>
+        <w:t>Completed Design Prototype Technical Workflow &amp; Application Structure document</w:t>
+      </w:r>
+    </w:p>
+    <w:p>
+      <w:pPr>
+        <w:rPr>
+          <w:b/>
+          <w:bCs/>
+        </w:rPr>
+      </w:pPr>
+      <w:r>
+        <w:rPr>
+          <w:b/>
+          <w:bCs/>
+        </w:rPr>
         <w:t xml:space="preserve">Note for next role: </w:t>
+      </w:r>
+      <w:r>
+        <w:rPr>
+          <w:b/>
+          <w:bCs/>
+        </w:rPr>
+        <w:t>N/A</w:t>
+      </w:r>
+    </w:p>
+    <w:p>
+      <w:r>
+        <w:rPr>
+          <w:b/>
+          <w:bCs/>
+        </w:rPr>
+        <w:t>Git URL:</w:t>
       </w:r>
     </w:p>
     <w:p>
@@ -5232,15 +5249,13 @@
           </w:tcPr>
           <w:p>
             <w:r>
-              <w:t xml:space="preserve">Dev 2: </w:t>
-            </w:r>
-            <w:proofErr w:type="spellStart"/>
-            <w:r>
-              <w:t>Tianxang</w:t>
-            </w:r>
-            <w:proofErr w:type="spellEnd"/>
-            <w:r>
-              <w:t xml:space="preserve"> Hang  </w:t>
+              <w:t>Dev 2: Tianx</w:t>
+            </w:r>
+            <w:r>
+              <w:t>i</w:t>
+            </w:r>
+            <w:r>
+              <w:t>ang Hang  </w:t>
             </w:r>
           </w:p>
         </w:tc>
@@ -5348,7 +5363,7 @@
 </file>
 
 <file path=word/endnotes.xml><?xml version="1.0" encoding="utf-8"?>
-<w:endnotes xmlns:wpc="http://schemas.microsoft.com/office/word/2010/wordprocessingCanvas" xmlns:cx="http://schemas.microsoft.com/office/drawing/2014/chartex" xmlns:cx1="http://schemas.microsoft.com/office/drawing/2015/9/8/chartex" xmlns:cx2="http://schemas.microsoft.com/office/drawing/2015/10/21/chartex" xmlns:cx3="http://schemas.microsoft.com/office/drawing/2016/5/9/chartex" xmlns:cx4="http://schemas.microsoft.com/office/drawing/2016/5/10/chartex" xmlns:cx5="http://schemas.microsoft.com/office/drawing/2016/5/11/chartex" xmlns:cx6="http://schemas.microsoft.com/office/drawing/2016/5/12/chartex" xmlns:cx7="http://schemas.microsoft.com/office/drawing/2016/5/13/chartex" xmlns:cx8="http://schemas.microsoft.com/office/drawing/2016/5/14/chartex" xmlns:mc="http://schemas.openxmlformats.org/markup-compatibility/2006" xmlns:m="http://schemas.openxmlformats.org/officeDocument/2006/math" xmlns:aink="http://schemas.microsoft.com/office/drawing/2016/ink" xmlns:am3d="http://schemas.microsoft.com/office/drawing/2017/model3d" xmlns:oel="http://schemas.microsoft.com/office/2019/extlst" xmlns:r="http://schemas.openxmlformats.org/officeDocument/2006/relationships" xmlns:wp14="http://schemas.microsoft.com/office/word/2010/wordprocessingDrawing" xmlns:wp="http://schemas.openxmlformats.org/drawingml/2006/wordprocessingDrawing" xmlns:wpg="http://schemas.microsoft.com/office/word/2010/wordprocessingGroup" xmlns:wpi="http://schemas.microsoft.com/office/word/2010/wordprocessingInk" xmlns:wps="http://schemas.microsoft.com/office/word/2010/wordprocessingShape" xmlns:o="urn:schemas-microsoft-com:office:office" xmlns:v="urn:schemas-microsoft-com:vml" xmlns:w10="urn:schemas-microsoft-com:office:word" xmlns:w="http://schemas.openxmlformats.org/wordprocessingml/2006/main" xmlns:w14="http://schemas.microsoft.com/office/word/2010/wordml" xmlns:w15="http://schemas.microsoft.com/office/word/2012/wordml" xmlns:w16cex="http://schemas.microsoft.com/office/word/2018/wordml/cex" xmlns:w16cid="http://schemas.microsoft.com/office/word/2016/wordml/cid" xmlns:w16="http://schemas.microsoft.com/office/word/2018/wordml" xmlns:w16sdtdh="http://schemas.microsoft.com/office/word/2020/wordml/sdtdatahash" xmlns:w16sdtfl="http://schemas.microsoft.com/office/word/2024/wordml/sdtformatlock" xmlns:w16se="http://schemas.microsoft.com/office/word/2015/wordml/symex" xmlns:w16du="http://schemas.microsoft.com/office/word/2023/wordml/word16du" xmlns:wne="http://schemas.microsoft.com/office/word/2006/wordml" mc:Ignorable="w14 w15 w16se w16cid w16 w16cex w16sdtdh w16sdtfl w16du wp14">
+<w:endnotes xmlns:wpc="http://schemas.microsoft.com/office/word/2010/wordprocessingCanvas" xmlns:cx="http://schemas.microsoft.com/office/drawing/2014/chartex" xmlns:cx1="http://schemas.microsoft.com/office/drawing/2015/9/8/chartex" xmlns:cx2="http://schemas.microsoft.com/office/drawing/2015/10/21/chartex" xmlns:cx3="http://schemas.microsoft.com/office/drawing/2016/5/9/chartex" xmlns:cx4="http://schemas.microsoft.com/office/drawing/2016/5/10/chartex" xmlns:cx5="http://schemas.microsoft.com/office/drawing/2016/5/11/chartex" xmlns:cx6="http://schemas.microsoft.com/office/drawing/2016/5/12/chartex" xmlns:cx7="http://schemas.microsoft.com/office/drawing/2016/5/13/chartex" xmlns:cx8="http://schemas.microsoft.com/office/drawing/2016/5/14/chartex" xmlns:mc="http://schemas.openxmlformats.org/markup-compatibility/2006" xmlns:aink="http://schemas.microsoft.com/office/drawing/2016/ink" xmlns:am3d="http://schemas.microsoft.com/office/drawing/2017/model3d" xmlns:o="urn:schemas-microsoft-com:office:office" xmlns:oel="http://schemas.microsoft.com/office/2019/extlst" xmlns:r="http://schemas.openxmlformats.org/officeDocument/2006/relationships" xmlns:m="http://schemas.openxmlformats.org/officeDocument/2006/math" xmlns:v="urn:schemas-microsoft-com:vml" xmlns:wp14="http://schemas.microsoft.com/office/word/2010/wordprocessingDrawing" xmlns:wp="http://schemas.openxmlformats.org/drawingml/2006/wordprocessingDrawing" xmlns:w10="urn:schemas-microsoft-com:office:word" xmlns:w="http://schemas.openxmlformats.org/wordprocessingml/2006/main" xmlns:w14="http://schemas.microsoft.com/office/word/2010/wordml" xmlns:w15="http://schemas.microsoft.com/office/word/2012/wordml" xmlns:w16cex="http://schemas.microsoft.com/office/word/2018/wordml/cex" xmlns:w16cid="http://schemas.microsoft.com/office/word/2016/wordml/cid" xmlns:w16="http://schemas.microsoft.com/office/word/2018/wordml" xmlns:w16du="http://schemas.microsoft.com/office/word/2023/wordml/word16du" xmlns:w16sdtdh="http://schemas.microsoft.com/office/word/2020/wordml/sdtdatahash" xmlns:w16sdtfl="http://schemas.microsoft.com/office/word/2024/wordml/sdtformatlock" xmlns:w16se="http://schemas.microsoft.com/office/word/2015/wordml/symex" xmlns:wpg="http://schemas.microsoft.com/office/word/2010/wordprocessingGroup" xmlns:wpi="http://schemas.microsoft.com/office/word/2010/wordprocessingInk" xmlns:wne="http://schemas.microsoft.com/office/word/2006/wordml" xmlns:wps="http://schemas.microsoft.com/office/word/2010/wordprocessingShape" mc:Ignorable="w14 w15 w16se w16cid w16 w16cex w16sdtdh w16sdtfl w16du wp14">
   <w:endnote w:type="separator" w:id="-1">
     <w:p>
       <w:r>
@@ -5367,7 +5382,7 @@
 </file>
 
 <file path=word/footer1.xml><?xml version="1.0" encoding="utf-8"?>
-<w:ftr xmlns:wpc="http://schemas.microsoft.com/office/word/2010/wordprocessingCanvas" xmlns:cx="http://schemas.microsoft.com/office/drawing/2014/chartex" xmlns:cx1="http://schemas.microsoft.com/office/drawing/2015/9/8/chartex" xmlns:cx2="http://schemas.microsoft.com/office/drawing/2015/10/21/chartex" xmlns:cx3="http://schemas.microsoft.com/office/drawing/2016/5/9/chartex" xmlns:cx4="http://schemas.microsoft.com/office/drawing/2016/5/10/chartex" xmlns:cx5="http://schemas.microsoft.com/office/drawing/2016/5/11/chartex" xmlns:cx6="http://schemas.microsoft.com/office/drawing/2016/5/12/chartex" xmlns:cx7="http://schemas.microsoft.com/office/drawing/2016/5/13/chartex" xmlns:cx8="http://schemas.microsoft.com/office/drawing/2016/5/14/chartex" xmlns:mc="http://schemas.openxmlformats.org/markup-compatibility/2006" xmlns:m="http://schemas.openxmlformats.org/officeDocument/2006/math" xmlns:aink="http://schemas.microsoft.com/office/drawing/2016/ink" xmlns:am3d="http://schemas.microsoft.com/office/drawing/2017/model3d" xmlns:oel="http://schemas.microsoft.com/office/2019/extlst" xmlns:r="http://schemas.openxmlformats.org/officeDocument/2006/relationships" xmlns:wp14="http://schemas.microsoft.com/office/word/2010/wordprocessingDrawing" xmlns:wp="http://schemas.openxmlformats.org/drawingml/2006/wordprocessingDrawing" xmlns:wpg="http://schemas.microsoft.com/office/word/2010/wordprocessingGroup" xmlns:wpi="http://schemas.microsoft.com/office/word/2010/wordprocessingInk" xmlns:wps="http://schemas.microsoft.com/office/word/2010/wordprocessingShape" xmlns:o="urn:schemas-microsoft-com:office:office" xmlns:v="urn:schemas-microsoft-com:vml" xmlns:w10="urn:schemas-microsoft-com:office:word" xmlns:w="http://schemas.openxmlformats.org/wordprocessingml/2006/main" xmlns:w14="http://schemas.microsoft.com/office/word/2010/wordml" xmlns:w15="http://schemas.microsoft.com/office/word/2012/wordml" xmlns:w16cex="http://schemas.microsoft.com/office/word/2018/wordml/cex" xmlns:w16cid="http://schemas.microsoft.com/office/word/2016/wordml/cid" xmlns:w16="http://schemas.microsoft.com/office/word/2018/wordml" xmlns:w16sdtdh="http://schemas.microsoft.com/office/word/2020/wordml/sdtdatahash" xmlns:w16sdtfl="http://schemas.microsoft.com/office/word/2024/wordml/sdtformatlock" xmlns:w16se="http://schemas.microsoft.com/office/word/2015/wordml/symex" xmlns:w16du="http://schemas.microsoft.com/office/word/2023/wordml/word16du" xmlns:wne="http://schemas.microsoft.com/office/word/2006/wordml" mc:Ignorable="w14 w15 w16se w16cid w16 w16cex w16sdtdh w16sdtfl w16du wp14">
+<w:ftr xmlns:wpc="http://schemas.microsoft.com/office/word/2010/wordprocessingCanvas" xmlns:cx="http://schemas.microsoft.com/office/drawing/2014/chartex" xmlns:cx1="http://schemas.microsoft.com/office/drawing/2015/9/8/chartex" xmlns:cx2="http://schemas.microsoft.com/office/drawing/2015/10/21/chartex" xmlns:cx3="http://schemas.microsoft.com/office/drawing/2016/5/9/chartex" xmlns:cx4="http://schemas.microsoft.com/office/drawing/2016/5/10/chartex" xmlns:cx5="http://schemas.microsoft.com/office/drawing/2016/5/11/chartex" xmlns:cx6="http://schemas.microsoft.com/office/drawing/2016/5/12/chartex" xmlns:cx7="http://schemas.microsoft.com/office/drawing/2016/5/13/chartex" xmlns:cx8="http://schemas.microsoft.com/office/drawing/2016/5/14/chartex" xmlns:mc="http://schemas.openxmlformats.org/markup-compatibility/2006" xmlns:aink="http://schemas.microsoft.com/office/drawing/2016/ink" xmlns:am3d="http://schemas.microsoft.com/office/drawing/2017/model3d" xmlns:o="urn:schemas-microsoft-com:office:office" xmlns:oel="http://schemas.microsoft.com/office/2019/extlst" xmlns:r="http://schemas.openxmlformats.org/officeDocument/2006/relationships" xmlns:m="http://schemas.openxmlformats.org/officeDocument/2006/math" xmlns:v="urn:schemas-microsoft-com:vml" xmlns:wp14="http://schemas.microsoft.com/office/word/2010/wordprocessingDrawing" xmlns:wp="http://schemas.openxmlformats.org/drawingml/2006/wordprocessingDrawing" xmlns:w10="urn:schemas-microsoft-com:office:word" xmlns:w="http://schemas.openxmlformats.org/wordprocessingml/2006/main" xmlns:w14="http://schemas.microsoft.com/office/word/2010/wordml" xmlns:w15="http://schemas.microsoft.com/office/word/2012/wordml" xmlns:w16cex="http://schemas.microsoft.com/office/word/2018/wordml/cex" xmlns:w16cid="http://schemas.microsoft.com/office/word/2016/wordml/cid" xmlns:w16="http://schemas.microsoft.com/office/word/2018/wordml" xmlns:w16du="http://schemas.microsoft.com/office/word/2023/wordml/word16du" xmlns:w16sdtdh="http://schemas.microsoft.com/office/word/2020/wordml/sdtdatahash" xmlns:w16sdtfl="http://schemas.microsoft.com/office/word/2024/wordml/sdtformatlock" xmlns:w16se="http://schemas.microsoft.com/office/word/2015/wordml/symex" xmlns:wpg="http://schemas.microsoft.com/office/word/2010/wordprocessingGroup" xmlns:wpi="http://schemas.microsoft.com/office/word/2010/wordprocessingInk" xmlns:wne="http://schemas.microsoft.com/office/word/2006/wordml" xmlns:wps="http://schemas.microsoft.com/office/word/2010/wordprocessingShape" mc:Ignorable="w14 w15 w16se w16cid w16 w16cex w16sdtdh w16sdtfl w16du wp14">
   <w:tbl>
     <w:tblPr>
       <w:tblW w:w="0" w:type="auto"/>
@@ -5427,7 +5442,7 @@
 </file>
 
 <file path=word/footnotes.xml><?xml version="1.0" encoding="utf-8"?>
-<w:footnotes xmlns:wpc="http://schemas.microsoft.com/office/word/2010/wordprocessingCanvas" xmlns:cx="http://schemas.microsoft.com/office/drawing/2014/chartex" xmlns:cx1="http://schemas.microsoft.com/office/drawing/2015/9/8/chartex" xmlns:cx2="http://schemas.microsoft.com/office/drawing/2015/10/21/chartex" xmlns:cx3="http://schemas.microsoft.com/office/drawing/2016/5/9/chartex" xmlns:cx4="http://schemas.microsoft.com/office/drawing/2016/5/10/chartex" xmlns:cx5="http://schemas.microsoft.com/office/drawing/2016/5/11/chartex" xmlns:cx6="http://schemas.microsoft.com/office/drawing/2016/5/12/chartex" xmlns:cx7="http://schemas.microsoft.com/office/drawing/2016/5/13/chartex" xmlns:cx8="http://schemas.microsoft.com/office/drawing/2016/5/14/chartex" xmlns:mc="http://schemas.openxmlformats.org/markup-compatibility/2006" xmlns:m="http://schemas.openxmlformats.org/officeDocument/2006/math" xmlns:aink="http://schemas.microsoft.com/office/drawing/2016/ink" xmlns:am3d="http://schemas.microsoft.com/office/drawing/2017/model3d" xmlns:oel="http://schemas.microsoft.com/office/2019/extlst" xmlns:r="http://schemas.openxmlformats.org/officeDocument/2006/relationships" xmlns:wp14="http://schemas.microsoft.com/office/word/2010/wordprocessingDrawing" xmlns:wp="http://schemas.openxmlformats.org/drawingml/2006/wordprocessingDrawing" xmlns:wpg="http://schemas.microsoft.com/office/word/2010/wordprocessingGroup" xmlns:wpi="http://schemas.microsoft.com/office/word/2010/wordprocessingInk" xmlns:wps="http://schemas.microsoft.com/office/word/2010/wordprocessingShape" xmlns:o="urn:schemas-microsoft-com:office:office" xmlns:v="urn:schemas-microsoft-com:vml" xmlns:w10="urn:schemas-microsoft-com:office:word" xmlns:w="http://schemas.openxmlformats.org/wordprocessingml/2006/main" xmlns:w14="http://schemas.microsoft.com/office/word/2010/wordml" xmlns:w15="http://schemas.microsoft.com/office/word/2012/wordml" xmlns:w16cex="http://schemas.microsoft.com/office/word/2018/wordml/cex" xmlns:w16cid="http://schemas.microsoft.com/office/word/2016/wordml/cid" xmlns:w16="http://schemas.microsoft.com/office/word/2018/wordml" xmlns:w16sdtdh="http://schemas.microsoft.com/office/word/2020/wordml/sdtdatahash" xmlns:w16sdtfl="http://schemas.microsoft.com/office/word/2024/wordml/sdtformatlock" xmlns:w16se="http://schemas.microsoft.com/office/word/2015/wordml/symex" xmlns:w16du="http://schemas.microsoft.com/office/word/2023/wordml/word16du" xmlns:wne="http://schemas.microsoft.com/office/word/2006/wordml" mc:Ignorable="w14 w15 w16se w16cid w16 w16cex w16sdtdh w16sdtfl w16du wp14">
+<w:footnotes xmlns:wpc="http://schemas.microsoft.com/office/word/2010/wordprocessingCanvas" xmlns:cx="http://schemas.microsoft.com/office/drawing/2014/chartex" xmlns:cx1="http://schemas.microsoft.com/office/drawing/2015/9/8/chartex" xmlns:cx2="http://schemas.microsoft.com/office/drawing/2015/10/21/chartex" xmlns:cx3="http://schemas.microsoft.com/office/drawing/2016/5/9/chartex" xmlns:cx4="http://schemas.microsoft.com/office/drawing/2016/5/10/chartex" xmlns:cx5="http://schemas.microsoft.com/office/drawing/2016/5/11/chartex" xmlns:cx6="http://schemas.microsoft.com/office/drawing/2016/5/12/chartex" xmlns:cx7="http://schemas.microsoft.com/office/drawing/2016/5/13/chartex" xmlns:cx8="http://schemas.microsoft.com/office/drawing/2016/5/14/chartex" xmlns:mc="http://schemas.openxmlformats.org/markup-compatibility/2006" xmlns:aink="http://schemas.microsoft.com/office/drawing/2016/ink" xmlns:am3d="http://schemas.microsoft.com/office/drawing/2017/model3d" xmlns:o="urn:schemas-microsoft-com:office:office" xmlns:oel="http://schemas.microsoft.com/office/2019/extlst" xmlns:r="http://schemas.openxmlformats.org/officeDocument/2006/relationships" xmlns:m="http://schemas.openxmlformats.org/officeDocument/2006/math" xmlns:v="urn:schemas-microsoft-com:vml" xmlns:wp14="http://schemas.microsoft.com/office/word/2010/wordprocessingDrawing" xmlns:wp="http://schemas.openxmlformats.org/drawingml/2006/wordprocessingDrawing" xmlns:w10="urn:schemas-microsoft-com:office:word" xmlns:w="http://schemas.openxmlformats.org/wordprocessingml/2006/main" xmlns:w14="http://schemas.microsoft.com/office/word/2010/wordml" xmlns:w15="http://schemas.microsoft.com/office/word/2012/wordml" xmlns:w16cex="http://schemas.microsoft.com/office/word/2018/wordml/cex" xmlns:w16cid="http://schemas.microsoft.com/office/word/2016/wordml/cid" xmlns:w16="http://schemas.microsoft.com/office/word/2018/wordml" xmlns:w16du="http://schemas.microsoft.com/office/word/2023/wordml/word16du" xmlns:w16sdtdh="http://schemas.microsoft.com/office/word/2020/wordml/sdtdatahash" xmlns:w16sdtfl="http://schemas.microsoft.com/office/word/2024/wordml/sdtformatlock" xmlns:w16se="http://schemas.microsoft.com/office/word/2015/wordml/symex" xmlns:wpg="http://schemas.microsoft.com/office/word/2010/wordprocessingGroup" xmlns:wpi="http://schemas.microsoft.com/office/word/2010/wordprocessingInk" xmlns:wne="http://schemas.microsoft.com/office/word/2006/wordml" xmlns:wps="http://schemas.microsoft.com/office/word/2010/wordprocessingShape" mc:Ignorable="w14 w15 w16se w16cid w16 w16cex w16sdtdh w16sdtfl w16du wp14">
   <w:footnote w:type="separator" w:id="-1">
     <w:p>
       <w:r>
@@ -5446,7 +5461,7 @@
 </file>
 
 <file path=word/header1.xml><?xml version="1.0" encoding="utf-8"?>
-<w:hdr xmlns:wpc="http://schemas.microsoft.com/office/word/2010/wordprocessingCanvas" xmlns:cx="http://schemas.microsoft.com/office/drawing/2014/chartex" xmlns:cx1="http://schemas.microsoft.com/office/drawing/2015/9/8/chartex" xmlns:cx2="http://schemas.microsoft.com/office/drawing/2015/10/21/chartex" xmlns:cx3="http://schemas.microsoft.com/office/drawing/2016/5/9/chartex" xmlns:cx4="http://schemas.microsoft.com/office/drawing/2016/5/10/chartex" xmlns:cx5="http://schemas.microsoft.com/office/drawing/2016/5/11/chartex" xmlns:cx6="http://schemas.microsoft.com/office/drawing/2016/5/12/chartex" xmlns:cx7="http://schemas.microsoft.com/office/drawing/2016/5/13/chartex" xmlns:cx8="http://schemas.microsoft.com/office/drawing/2016/5/14/chartex" xmlns:mc="http://schemas.openxmlformats.org/markup-compatibility/2006" xmlns:m="http://schemas.openxmlformats.org/officeDocument/2006/math" xmlns:aink="http://schemas.microsoft.com/office/drawing/2016/ink" xmlns:am3d="http://schemas.microsoft.com/office/drawing/2017/model3d" xmlns:oel="http://schemas.microsoft.com/office/2019/extlst" xmlns:r="http://schemas.openxmlformats.org/officeDocument/2006/relationships" xmlns:wp14="http://schemas.microsoft.com/office/word/2010/wordprocessingDrawing" xmlns:wp="http://schemas.openxmlformats.org/drawingml/2006/wordprocessingDrawing" xmlns:wpg="http://schemas.microsoft.com/office/word/2010/wordprocessingGroup" xmlns:wpi="http://schemas.microsoft.com/office/word/2010/wordprocessingInk" xmlns:wps="http://schemas.microsoft.com/office/word/2010/wordprocessingShape" xmlns:o="urn:schemas-microsoft-com:office:office" xmlns:v="urn:schemas-microsoft-com:vml" xmlns:w10="urn:schemas-microsoft-com:office:word" xmlns:w="http://schemas.openxmlformats.org/wordprocessingml/2006/main" xmlns:w14="http://schemas.microsoft.com/office/word/2010/wordml" xmlns:w15="http://schemas.microsoft.com/office/word/2012/wordml" xmlns:w16cex="http://schemas.microsoft.com/office/word/2018/wordml/cex" xmlns:w16cid="http://schemas.microsoft.com/office/word/2016/wordml/cid" xmlns:w16="http://schemas.microsoft.com/office/word/2018/wordml" xmlns:w16sdtdh="http://schemas.microsoft.com/office/word/2020/wordml/sdtdatahash" xmlns:w16sdtfl="http://schemas.microsoft.com/office/word/2024/wordml/sdtformatlock" xmlns:w16se="http://schemas.microsoft.com/office/word/2015/wordml/symex" xmlns:w16du="http://schemas.microsoft.com/office/word/2023/wordml/word16du" xmlns:wne="http://schemas.microsoft.com/office/word/2006/wordml" mc:Ignorable="w14 w15 w16se w16cid w16 w16cex w16sdtdh w16sdtfl w16du wp14">
+<w:hdr xmlns:wpc="http://schemas.microsoft.com/office/word/2010/wordprocessingCanvas" xmlns:cx="http://schemas.microsoft.com/office/drawing/2014/chartex" xmlns:cx1="http://schemas.microsoft.com/office/drawing/2015/9/8/chartex" xmlns:cx2="http://schemas.microsoft.com/office/drawing/2015/10/21/chartex" xmlns:cx3="http://schemas.microsoft.com/office/drawing/2016/5/9/chartex" xmlns:cx4="http://schemas.microsoft.com/office/drawing/2016/5/10/chartex" xmlns:cx5="http://schemas.microsoft.com/office/drawing/2016/5/11/chartex" xmlns:cx6="http://schemas.microsoft.com/office/drawing/2016/5/12/chartex" xmlns:cx7="http://schemas.microsoft.com/office/drawing/2016/5/13/chartex" xmlns:cx8="http://schemas.microsoft.com/office/drawing/2016/5/14/chartex" xmlns:mc="http://schemas.openxmlformats.org/markup-compatibility/2006" xmlns:aink="http://schemas.microsoft.com/office/drawing/2016/ink" xmlns:am3d="http://schemas.microsoft.com/office/drawing/2017/model3d" xmlns:o="urn:schemas-microsoft-com:office:office" xmlns:oel="http://schemas.microsoft.com/office/2019/extlst" xmlns:r="http://schemas.openxmlformats.org/officeDocument/2006/relationships" xmlns:m="http://schemas.openxmlformats.org/officeDocument/2006/math" xmlns:v="urn:schemas-microsoft-com:vml" xmlns:wp14="http://schemas.microsoft.com/office/word/2010/wordprocessingDrawing" xmlns:wp="http://schemas.openxmlformats.org/drawingml/2006/wordprocessingDrawing" xmlns:w10="urn:schemas-microsoft-com:office:word" xmlns:w="http://schemas.openxmlformats.org/wordprocessingml/2006/main" xmlns:w14="http://schemas.microsoft.com/office/word/2010/wordml" xmlns:w15="http://schemas.microsoft.com/office/word/2012/wordml" xmlns:w16cex="http://schemas.microsoft.com/office/word/2018/wordml/cex" xmlns:w16cid="http://schemas.microsoft.com/office/word/2016/wordml/cid" xmlns:w16="http://schemas.microsoft.com/office/word/2018/wordml" xmlns:w16du="http://schemas.microsoft.com/office/word/2023/wordml/word16du" xmlns:w16sdtdh="http://schemas.microsoft.com/office/word/2020/wordml/sdtdatahash" xmlns:w16sdtfl="http://schemas.microsoft.com/office/word/2024/wordml/sdtformatlock" xmlns:w16se="http://schemas.microsoft.com/office/word/2015/wordml/symex" xmlns:wpg="http://schemas.microsoft.com/office/word/2010/wordprocessingGroup" xmlns:wpi="http://schemas.microsoft.com/office/word/2010/wordprocessingInk" xmlns:wne="http://schemas.microsoft.com/office/word/2006/wordml" xmlns:wps="http://schemas.microsoft.com/office/word/2010/wordprocessingShape" mc:Ignorable="w14 w15 w16se w16cid w16 w16cex w16sdtdh w16sdtfl w16du wp14">
   <w:p>
     <w:pPr>
       <w:pStyle w:val="Header"/>
@@ -5522,7 +5537,7 @@
 </file>
 
 <file path=word/numbering.xml><?xml version="1.0" encoding="utf-8"?>
-<w:numbering xmlns:wpc="http://schemas.microsoft.com/office/word/2010/wordprocessingCanvas" xmlns:cx="http://schemas.microsoft.com/office/drawing/2014/chartex" xmlns:cx1="http://schemas.microsoft.com/office/drawing/2015/9/8/chartex" xmlns:cx2="http://schemas.microsoft.com/office/drawing/2015/10/21/chartex" xmlns:cx3="http://schemas.microsoft.com/office/drawing/2016/5/9/chartex" xmlns:cx4="http://schemas.microsoft.com/office/drawing/2016/5/10/chartex" xmlns:cx5="http://schemas.microsoft.com/office/drawing/2016/5/11/chartex" xmlns:cx6="http://schemas.microsoft.com/office/drawing/2016/5/12/chartex" xmlns:cx7="http://schemas.microsoft.com/office/drawing/2016/5/13/chartex" xmlns:cx8="http://schemas.microsoft.com/office/drawing/2016/5/14/chartex" xmlns:mc="http://schemas.openxmlformats.org/markup-compatibility/2006" xmlns:m="http://schemas.openxmlformats.org/officeDocument/2006/math" xmlns:aink="http://schemas.microsoft.com/office/drawing/2016/ink" xmlns:am3d="http://schemas.microsoft.com/office/drawing/2017/model3d" xmlns:oel="http://schemas.microsoft.com/office/2019/extlst" xmlns:r="http://schemas.openxmlformats.org/officeDocument/2006/relationships" xmlns:wp14="http://schemas.microsoft.com/office/word/2010/wordprocessingDrawing" xmlns:wp="http://schemas.openxmlformats.org/drawingml/2006/wordprocessingDrawing" xmlns:wpg="http://schemas.microsoft.com/office/word/2010/wordprocessingGroup" xmlns:wpi="http://schemas.microsoft.com/office/word/2010/wordprocessingInk" xmlns:wps="http://schemas.microsoft.com/office/word/2010/wordprocessingShape" xmlns:o="urn:schemas-microsoft-com:office:office" xmlns:v="urn:schemas-microsoft-com:vml" xmlns:w10="urn:schemas-microsoft-com:office:word" xmlns:w="http://schemas.openxmlformats.org/wordprocessingml/2006/main" xmlns:w14="http://schemas.microsoft.com/office/word/2010/wordml" xmlns:w15="http://schemas.microsoft.com/office/word/2012/wordml" xmlns:w16cex="http://schemas.microsoft.com/office/word/2018/wordml/cex" xmlns:w16cid="http://schemas.microsoft.com/office/word/2016/wordml/cid" xmlns:w16="http://schemas.microsoft.com/office/word/2018/wordml" xmlns:w16sdtdh="http://schemas.microsoft.com/office/word/2020/wordml/sdtdatahash" xmlns:w16sdtfl="http://schemas.microsoft.com/office/word/2024/wordml/sdtformatlock" xmlns:w16se="http://schemas.microsoft.com/office/word/2015/wordml/symex" xmlns:w16du="http://schemas.microsoft.com/office/word/2023/wordml/word16du" xmlns:wne="http://schemas.microsoft.com/office/word/2006/wordml" mc:Ignorable="w14 w15 w16se w16cid w16 w16cex w16sdtdh w16sdtfl w16du wp14">
+<w:numbering xmlns:wpc="http://schemas.microsoft.com/office/word/2010/wordprocessingCanvas" xmlns:cx="http://schemas.microsoft.com/office/drawing/2014/chartex" xmlns:cx1="http://schemas.microsoft.com/office/drawing/2015/9/8/chartex" xmlns:cx2="http://schemas.microsoft.com/office/drawing/2015/10/21/chartex" xmlns:cx3="http://schemas.microsoft.com/office/drawing/2016/5/9/chartex" xmlns:cx4="http://schemas.microsoft.com/office/drawing/2016/5/10/chartex" xmlns:cx5="http://schemas.microsoft.com/office/drawing/2016/5/11/chartex" xmlns:cx6="http://schemas.microsoft.com/office/drawing/2016/5/12/chartex" xmlns:cx7="http://schemas.microsoft.com/office/drawing/2016/5/13/chartex" xmlns:cx8="http://schemas.microsoft.com/office/drawing/2016/5/14/chartex" xmlns:mc="http://schemas.openxmlformats.org/markup-compatibility/2006" xmlns:aink="http://schemas.microsoft.com/office/drawing/2016/ink" xmlns:am3d="http://schemas.microsoft.com/office/drawing/2017/model3d" xmlns:o="urn:schemas-microsoft-com:office:office" xmlns:oel="http://schemas.microsoft.com/office/2019/extlst" xmlns:r="http://schemas.openxmlformats.org/officeDocument/2006/relationships" xmlns:m="http://schemas.openxmlformats.org/officeDocument/2006/math" xmlns:v="urn:schemas-microsoft-com:vml" xmlns:wp14="http://schemas.microsoft.com/office/word/2010/wordprocessingDrawing" xmlns:wp="http://schemas.openxmlformats.org/drawingml/2006/wordprocessingDrawing" xmlns:w10="urn:schemas-microsoft-com:office:word" xmlns:w="http://schemas.openxmlformats.org/wordprocessingml/2006/main" xmlns:w14="http://schemas.microsoft.com/office/word/2010/wordml" xmlns:w15="http://schemas.microsoft.com/office/word/2012/wordml" xmlns:w16cex="http://schemas.microsoft.com/office/word/2018/wordml/cex" xmlns:w16cid="http://schemas.microsoft.com/office/word/2016/wordml/cid" xmlns:w16="http://schemas.microsoft.com/office/word/2018/wordml" xmlns:w16du="http://schemas.microsoft.com/office/word/2023/wordml/word16du" xmlns:w16sdtdh="http://schemas.microsoft.com/office/word/2020/wordml/sdtdatahash" xmlns:w16sdtfl="http://schemas.microsoft.com/office/word/2024/wordml/sdtformatlock" xmlns:w16se="http://schemas.microsoft.com/office/word/2015/wordml/symex" xmlns:wpg="http://schemas.microsoft.com/office/word/2010/wordprocessingGroup" xmlns:wpi="http://schemas.microsoft.com/office/word/2010/wordprocessingInk" xmlns:wne="http://schemas.microsoft.com/office/word/2006/wordml" xmlns:wps="http://schemas.microsoft.com/office/word/2010/wordprocessingShape" mc:Ignorable="w14 w15 w16se w16cid w16 w16cex w16sdtdh w16sdtfl w16du wp14">
   <w:abstractNum w:abstractNumId="0" w15:restartNumberingAfterBreak="0">
     <w:nsid w:val="050B24B6"/>
     <w:multiLevelType w:val="hybridMultilevel"/>
@@ -5619,7 +5634,7 @@
 </file>
 
 <file path=word/styles.xml><?xml version="1.0" encoding="utf-8"?>
-<w:styles xmlns:mc="http://schemas.openxmlformats.org/markup-compatibility/2006" xmlns:r="http://schemas.openxmlformats.org/officeDocument/2006/relationships" xmlns:w="http://schemas.openxmlformats.org/wordprocessingml/2006/main" xmlns:w14="http://schemas.microsoft.com/office/word/2010/wordml" xmlns:w15="http://schemas.microsoft.com/office/word/2012/wordml" xmlns:w16cex="http://schemas.microsoft.com/office/word/2018/wordml/cex" xmlns:w16cid="http://schemas.microsoft.com/office/word/2016/wordml/cid" xmlns:w16="http://schemas.microsoft.com/office/word/2018/wordml" xmlns:w16sdtdh="http://schemas.microsoft.com/office/word/2020/wordml/sdtdatahash" xmlns:w16sdtfl="http://schemas.microsoft.com/office/word/2024/wordml/sdtformatlock" xmlns:w16se="http://schemas.microsoft.com/office/word/2015/wordml/symex" xmlns:w16du="http://schemas.microsoft.com/office/word/2023/wordml/word16du" mc:Ignorable="w14 w15 w16se w16cid w16 w16cex w16sdtdh w16sdtfl w16du">
+<w:styles xmlns:mc="http://schemas.openxmlformats.org/markup-compatibility/2006" xmlns:r="http://schemas.openxmlformats.org/officeDocument/2006/relationships" xmlns:w="http://schemas.openxmlformats.org/wordprocessingml/2006/main" xmlns:w14="http://schemas.microsoft.com/office/word/2010/wordml" xmlns:w15="http://schemas.microsoft.com/office/word/2012/wordml" xmlns:w16cex="http://schemas.microsoft.com/office/word/2018/wordml/cex" xmlns:w16cid="http://schemas.microsoft.com/office/word/2016/wordml/cid" xmlns:w16="http://schemas.microsoft.com/office/word/2018/wordml" xmlns:w16du="http://schemas.microsoft.com/office/word/2023/wordml/word16du" xmlns:w16sdtdh="http://schemas.microsoft.com/office/word/2020/wordml/sdtdatahash" xmlns:w16sdtfl="http://schemas.microsoft.com/office/word/2024/wordml/sdtformatlock" xmlns:w16se="http://schemas.microsoft.com/office/word/2015/wordml/symex" mc:Ignorable="w14 w15 w16se w16cid w16 w16cex w16sdtdh w16sdtfl w16du">
   <w:docDefaults>
     <w:rPrDefault>
       <w:rPr>

</xml_diff>